<commit_message>
Polish Background & Homepage Merch editor docs and share-link checks
Co-authored-by: Cursor <cursoragent@cursor.com>
</commit_message>
<xml_diff>
--- a/GMF-Productions-Editor-Guide.docx
+++ b/GMF-Productions-Editor-Guide.docx
@@ -587,7 +587,7 @@
           <w:sz w:val="22"/>
           <w:szCs w:val="22"/>
         </w:rPr>
-        <w:t xml:space="preserve">Photos &amp; Images — hero background and uploads</w:t>
+        <w:t xml:space="preserve">Background &amp; Homepage Merch — site background image + the 3 products on the home page</w:t>
       </w:r>
     </w:p>
     <w:p>
@@ -1041,61 +1041,7 @@
           <w:sz w:val="40"/>
           <w:szCs w:val="40"/>
         </w:rPr>
-        <w:t xml:space="preserve">6. Edit Words on Pages</w:t>
-      </w:r>
-    </w:p>
-    <w:p>
-      <w:pPr>
-        <w:pStyle w:val="ListParagraph"/>
-        <w:numPr>
-          <w:ilvl w:val="0"/>
-          <w:numId w:val="2"/>
-        </w:numPr>
-        <w:spacing w:after="80"/>
-      </w:pPr>
-      <w:r>
-        <w:rPr>
-          <w:color w:val="444444"/>
-          <w:sz w:val="22"/>
-          <w:szCs w:val="22"/>
-        </w:rPr>
-        <w:t xml:space="preserve">Click Homepage Text, Shop Page Text, About Page, Booking Text, or Contact Text.</w:t>
-      </w:r>
-    </w:p>
-    <w:p>
-      <w:pPr>
-        <w:pStyle w:val="ListParagraph"/>
-        <w:numPr>
-          <w:ilvl w:val="0"/>
-          <w:numId w:val="2"/>
-        </w:numPr>
-        <w:spacing w:after="80"/>
-      </w:pPr>
-      <w:r>
-        <w:rPr>
-          <w:color w:val="444444"/>
-          <w:sz w:val="22"/>
-          <w:szCs w:val="22"/>
-        </w:rPr>
-        <w:t xml:space="preserve">Change the headings and paragraphs.</w:t>
-      </w:r>
-    </w:p>
-    <w:p>
-      <w:pPr>
-        <w:pStyle w:val="ListParagraph"/>
-        <w:numPr>
-          <w:ilvl w:val="0"/>
-          <w:numId w:val="2"/>
-        </w:numPr>
-        <w:spacing w:after="80"/>
-      </w:pPr>
-      <w:r>
-        <w:rPr>
-          <w:color w:val="444444"/>
-          <w:sz w:val="22"/>
-          <w:szCs w:val="22"/>
-        </w:rPr>
-        <w:t xml:space="preserve">Click Save &amp; Publish.</w:t>
+        <w:t xml:space="preserve">6. Background &amp; Homepage Merch</w:t>
       </w:r>
     </w:p>
     <w:p>
@@ -1108,7 +1054,128 @@
           <w:sz w:val="22"/>
           <w:szCs w:val="22"/>
         </w:rPr>
-        <w:t xml:space="preserve">Fonts and layout stay the same — you only change the words.</w:t>
+        <w:t xml:space="preserve">Use this to change the look of the site and the three products shown on the home page Official Merch section.</w:t>
+      </w:r>
+    </w:p>
+    <w:p>
+      <w:pPr>
+        <w:spacing w:after="60"/>
+      </w:pPr>
+      <w:r>
+        <w:t xml:space="preserve"/>
+      </w:r>
+    </w:p>
+    <w:p>
+      <w:pPr>
+        <w:pStyle w:val="ListParagraph"/>
+        <w:numPr>
+          <w:ilvl w:val="0"/>
+          <w:numId w:val="2"/>
+        </w:numPr>
+        <w:spacing w:after="80"/>
+      </w:pPr>
+      <w:r>
+        <w:rPr>
+          <w:color w:val="444444"/>
+          <w:sz w:val="22"/>
+          <w:szCs w:val="22"/>
+        </w:rPr>
+        <w:t xml:space="preserve">Click Background &amp; Homepage Merch.</w:t>
+      </w:r>
+    </w:p>
+    <w:p>
+      <w:pPr>
+        <w:pStyle w:val="ListParagraph"/>
+        <w:numPr>
+          <w:ilvl w:val="0"/>
+          <w:numId w:val="2"/>
+        </w:numPr>
+        <w:spacing w:after="80"/>
+      </w:pPr>
+      <w:r>
+        <w:rPr>
+          <w:color w:val="444444"/>
+          <w:sz w:val="22"/>
+          <w:szCs w:val="22"/>
+        </w:rPr>
+        <w:t xml:space="preserve">Upload a JPG or PNG for the background (preferred). Or paste a direct image URL.</w:t>
+      </w:r>
+    </w:p>
+    <w:p>
+      <w:pPr>
+        <w:pStyle w:val="ListParagraph"/>
+        <w:numPr>
+          <w:ilvl w:val="0"/>
+          <w:numId w:val="2"/>
+        </w:numPr>
+        <w:spacing w:after="80"/>
+      </w:pPr>
+      <w:r>
+        <w:rPr>
+          <w:color w:val="444444"/>
+          <w:sz w:val="22"/>
+          <w:szCs w:val="22"/>
+        </w:rPr>
+        <w:t xml:space="preserve">Leave “Also use this image as a soft look across the whole website” checked if you want the same vibe on every page.</w:t>
+      </w:r>
+    </w:p>
+    <w:p>
+      <w:pPr>
+        <w:pStyle w:val="ListParagraph"/>
+        <w:numPr>
+          <w:ilvl w:val="0"/>
+          <w:numId w:val="2"/>
+        </w:numPr>
+        <w:spacing w:after="80"/>
+      </w:pPr>
+      <w:r>
+        <w:rPr>
+          <w:color w:val="444444"/>
+          <w:sz w:val="22"/>
+          <w:szCs w:val="22"/>
+        </w:rPr>
+        <w:t xml:space="preserve">For each of the 3 slots, pick a real product from the dropdown. You can change the display name, price, or upload a custom photo.</w:t>
+      </w:r>
+    </w:p>
+    <w:p>
+      <w:pPr>
+        <w:pStyle w:val="ListParagraph"/>
+        <w:numPr>
+          <w:ilvl w:val="0"/>
+          <w:numId w:val="2"/>
+        </w:numPr>
+        <w:spacing w:after="80"/>
+      </w:pPr>
+      <w:r>
+        <w:rPr>
+          <w:color w:val="444444"/>
+          <w:sz w:val="22"/>
+          <w:szCs w:val="22"/>
+        </w:rPr>
+        <w:t xml:space="preserve">Click Save &amp; Publish. Wait about 90 seconds, then refresh the home page.</w:t>
+      </w:r>
+    </w:p>
+    <w:p>
+      <w:pPr>
+        <w:spacing w:after="100"/>
+      </w:pPr>
+      <w:r>
+        <w:rPr>
+          <w:b/>
+          <w:bCs/>
+          <w:color w:val="050505"/>
+          <w:sz w:val="22"/>
+          <w:szCs w:val="22"/>
+        </w:rPr>
+        <w:t xml:space="preserve">Important: </w:t>
+      </w:r>
+      <w:r>
+        <w:rPr>
+          <w:color w:val="444444"/>
+          <w:sz w:val="22"/>
+          <w:szCs w:val="22"/>
+        </w:rPr>
+        <w:t xml:space="preserve">iCloud, Google Drive, Dropbox, and Canva share links will not work. Always Upload a real image file.</w:t>
       </w:r>
     </w:p>
     <w:p>
@@ -1136,115 +1203,74 @@
           <w:sz w:val="40"/>
           <w:szCs w:val="40"/>
         </w:rPr>
-        <w:t xml:space="preserve">7. Add a News or Promo Page</w:t>
-      </w:r>
-    </w:p>
-    <w:p>
-      <w:pPr>
-        <w:pStyle w:val="ListParagraph"/>
-        <w:numPr>
-          <w:ilvl w:val="0"/>
-          <w:numId w:val="2"/>
-        </w:numPr>
-        <w:spacing w:after="80"/>
-      </w:pPr>
-      <w:r>
-        <w:rPr>
-          <w:color w:val="444444"/>
-          <w:sz w:val="22"/>
-          <w:szCs w:val="22"/>
-        </w:rPr>
-        <w:t xml:space="preserve">Click Add a New Page.</w:t>
-      </w:r>
-    </w:p>
-    <w:p>
-      <w:pPr>
-        <w:pStyle w:val="ListParagraph"/>
-        <w:numPr>
-          <w:ilvl w:val="0"/>
-          <w:numId w:val="2"/>
-        </w:numPr>
-        <w:spacing w:after="80"/>
-      </w:pPr>
-      <w:r>
-        <w:rPr>
-          <w:color w:val="444444"/>
-          <w:sz w:val="22"/>
-          <w:szCs w:val="22"/>
-        </w:rPr>
-        <w:t xml:space="preserve">Choose News / Blog or Promo.</w:t>
-      </w:r>
-    </w:p>
-    <w:p>
-      <w:pPr>
-        <w:pStyle w:val="ListParagraph"/>
-        <w:numPr>
-          <w:ilvl w:val="0"/>
-          <w:numId w:val="2"/>
-        </w:numPr>
-        <w:spacing w:after="80"/>
-      </w:pPr>
-      <w:r>
-        <w:rPr>
-          <w:color w:val="444444"/>
-          <w:sz w:val="22"/>
-          <w:szCs w:val="22"/>
-        </w:rPr>
-        <w:t xml:space="preserve">Fill in Title, Short summary, and Body text.</w:t>
-      </w:r>
-    </w:p>
-    <w:p>
-      <w:pPr>
-        <w:pStyle w:val="ListParagraph"/>
-        <w:numPr>
-          <w:ilvl w:val="0"/>
-          <w:numId w:val="2"/>
-        </w:numPr>
-        <w:spacing w:after="80"/>
-      </w:pPr>
-      <w:r>
-        <w:rPr>
-          <w:color w:val="444444"/>
-          <w:sz w:val="22"/>
-          <w:szCs w:val="22"/>
-        </w:rPr>
-        <w:t xml:space="preserve">Optional: paste a YouTube link or image URL.</w:t>
-      </w:r>
-    </w:p>
-    <w:p>
-      <w:pPr>
-        <w:pStyle w:val="ListParagraph"/>
-        <w:numPr>
-          <w:ilvl w:val="0"/>
-          <w:numId w:val="2"/>
-        </w:numPr>
-        <w:spacing w:after="80"/>
-      </w:pPr>
-      <w:r>
-        <w:rPr>
-          <w:color w:val="444444"/>
-          <w:sz w:val="22"/>
-          <w:szCs w:val="22"/>
-        </w:rPr>
-        <w:t xml:space="preserve">Click Create &amp; Publish.</w:t>
-      </w:r>
-    </w:p>
-    <w:p>
-      <w:pPr>
-        <w:pStyle w:val="ListParagraph"/>
-        <w:numPr>
-          <w:ilvl w:val="0"/>
-          <w:numId w:val="2"/>
-        </w:numPr>
-        <w:spacing w:after="80"/>
-      </w:pPr>
-      <w:r>
-        <w:rPr>
-          <w:color w:val="444444"/>
-          <w:sz w:val="22"/>
-          <w:szCs w:val="22"/>
-        </w:rPr>
-        <w:t xml:space="preserve">Find it later at https://gmfproductions904.com/news</w:t>
+        <w:t xml:space="preserve">7. Edit Words on Pages</w:t>
+      </w:r>
+    </w:p>
+    <w:p>
+      <w:pPr>
+        <w:pStyle w:val="ListParagraph"/>
+        <w:numPr>
+          <w:ilvl w:val="0"/>
+          <w:numId w:val="2"/>
+        </w:numPr>
+        <w:spacing w:after="80"/>
+      </w:pPr>
+      <w:r>
+        <w:rPr>
+          <w:color w:val="444444"/>
+          <w:sz w:val="22"/>
+          <w:szCs w:val="22"/>
+        </w:rPr>
+        <w:t xml:space="preserve">Click Homepage Text, Shop Page Text, About Page, Booking Text, or Contact Text.</w:t>
+      </w:r>
+    </w:p>
+    <w:p>
+      <w:pPr>
+        <w:pStyle w:val="ListParagraph"/>
+        <w:numPr>
+          <w:ilvl w:val="0"/>
+          <w:numId w:val="2"/>
+        </w:numPr>
+        <w:spacing w:after="80"/>
+      </w:pPr>
+      <w:r>
+        <w:rPr>
+          <w:color w:val="444444"/>
+          <w:sz w:val="22"/>
+          <w:szCs w:val="22"/>
+        </w:rPr>
+        <w:t xml:space="preserve">Change the headings and paragraphs.</w:t>
+      </w:r>
+    </w:p>
+    <w:p>
+      <w:pPr>
+        <w:pStyle w:val="ListParagraph"/>
+        <w:numPr>
+          <w:ilvl w:val="0"/>
+          <w:numId w:val="2"/>
+        </w:numPr>
+        <w:spacing w:after="80"/>
+      </w:pPr>
+      <w:r>
+        <w:rPr>
+          <w:color w:val="444444"/>
+          <w:sz w:val="22"/>
+          <w:szCs w:val="22"/>
+        </w:rPr>
+        <w:t xml:space="preserve">Click Save &amp; Publish.</w:t>
+      </w:r>
+    </w:p>
+    <w:p>
+      <w:pPr>
+        <w:spacing w:after="100"/>
+      </w:pPr>
+      <w:r>
+        <w:rPr>
+          <w:color w:val="444444"/>
+          <w:sz w:val="22"/>
+          <w:szCs w:val="22"/>
+        </w:rPr>
+        <w:t xml:space="preserve">Fonts and layout stay the same — you only change the words.</w:t>
       </w:r>
     </w:p>
     <w:p>
@@ -1272,97 +1298,115 @@
           <w:sz w:val="40"/>
           <w:szCs w:val="40"/>
         </w:rPr>
-        <w:t xml:space="preserve">8. Rules to Remember</w:t>
-      </w:r>
-    </w:p>
-    <w:p>
-      <w:pPr>
-        <w:pStyle w:val="ListParagraph"/>
-        <w:numPr>
-          <w:ilvl w:val="0"/>
-          <w:numId w:val="1"/>
-        </w:numPr>
-        <w:spacing w:after="80"/>
-      </w:pPr>
-      <w:r>
-        <w:rPr>
-          <w:color w:val="444444"/>
-          <w:sz w:val="22"/>
-          <w:szCs w:val="22"/>
-        </w:rPr>
-        <w:t xml:space="preserve">Always click Save &amp; Publish when you are done.</w:t>
-      </w:r>
-    </w:p>
-    <w:p>
-      <w:pPr>
-        <w:pStyle w:val="ListParagraph"/>
-        <w:numPr>
-          <w:ilvl w:val="0"/>
-          <w:numId w:val="1"/>
-        </w:numPr>
-        <w:spacing w:after="80"/>
-      </w:pPr>
-      <w:r>
-        <w:rPr>
-          <w:color w:val="444444"/>
-          <w:sz w:val="22"/>
-          <w:szCs w:val="22"/>
-        </w:rPr>
-        <w:t xml:space="preserve">Prices are dollars only — 25 means $25.00.</w:t>
-      </w:r>
-    </w:p>
-    <w:p>
-      <w:pPr>
-        <w:pStyle w:val="ListParagraph"/>
-        <w:numPr>
-          <w:ilvl w:val="0"/>
-          <w:numId w:val="1"/>
-        </w:numPr>
-        <w:spacing w:after="80"/>
-      </w:pPr>
-      <w:r>
-        <w:rPr>
-          <w:color w:val="444444"/>
-          <w:sz w:val="22"/>
-          <w:szCs w:val="22"/>
-        </w:rPr>
-        <w:t xml:space="preserve">Paste full YouTube links; you do not need to find the ID yourself.</w:t>
-      </w:r>
-    </w:p>
-    <w:p>
-      <w:pPr>
-        <w:pStyle w:val="ListParagraph"/>
-        <w:numPr>
-          <w:ilvl w:val="0"/>
-          <w:numId w:val="1"/>
-        </w:numPr>
-        <w:spacing w:after="80"/>
-      </w:pPr>
-      <w:r>
-        <w:rPr>
-          <w:color w:val="444444"/>
-          <w:sz w:val="22"/>
-          <w:szCs w:val="22"/>
-        </w:rPr>
-        <w:t xml:space="preserve">If Save fails with a Git Gateway error, tell Chris — that setting lives in Netlify.</w:t>
-      </w:r>
-    </w:p>
-    <w:p>
-      <w:pPr>
-        <w:pStyle w:val="ListParagraph"/>
-        <w:numPr>
-          <w:ilvl w:val="0"/>
-          <w:numId w:val="1"/>
-        </w:numPr>
-        <w:spacing w:after="80"/>
-      </w:pPr>
-      <w:r>
-        <w:rPr>
-          <w:color w:val="444444"/>
-          <w:sz w:val="22"/>
-          <w:szCs w:val="22"/>
-        </w:rPr>
-        <w:t xml:space="preserve">After saving, wait ~90 seconds before checking the live site.</w:t>
+        <w:t xml:space="preserve">8. Add a News or Promo Page</w:t>
+      </w:r>
+    </w:p>
+    <w:p>
+      <w:pPr>
+        <w:pStyle w:val="ListParagraph"/>
+        <w:numPr>
+          <w:ilvl w:val="0"/>
+          <w:numId w:val="2"/>
+        </w:numPr>
+        <w:spacing w:after="80"/>
+      </w:pPr>
+      <w:r>
+        <w:rPr>
+          <w:color w:val="444444"/>
+          <w:sz w:val="22"/>
+          <w:szCs w:val="22"/>
+        </w:rPr>
+        <w:t xml:space="preserve">Click Add a New Page.</w:t>
+      </w:r>
+    </w:p>
+    <w:p>
+      <w:pPr>
+        <w:pStyle w:val="ListParagraph"/>
+        <w:numPr>
+          <w:ilvl w:val="0"/>
+          <w:numId w:val="2"/>
+        </w:numPr>
+        <w:spacing w:after="80"/>
+      </w:pPr>
+      <w:r>
+        <w:rPr>
+          <w:color w:val="444444"/>
+          <w:sz w:val="22"/>
+          <w:szCs w:val="22"/>
+        </w:rPr>
+        <w:t xml:space="preserve">Choose News / Blog or Promo.</w:t>
+      </w:r>
+    </w:p>
+    <w:p>
+      <w:pPr>
+        <w:pStyle w:val="ListParagraph"/>
+        <w:numPr>
+          <w:ilvl w:val="0"/>
+          <w:numId w:val="2"/>
+        </w:numPr>
+        <w:spacing w:after="80"/>
+      </w:pPr>
+      <w:r>
+        <w:rPr>
+          <w:color w:val="444444"/>
+          <w:sz w:val="22"/>
+          <w:szCs w:val="22"/>
+        </w:rPr>
+        <w:t xml:space="preserve">Fill in Title, Short summary, and Body text.</w:t>
+      </w:r>
+    </w:p>
+    <w:p>
+      <w:pPr>
+        <w:pStyle w:val="ListParagraph"/>
+        <w:numPr>
+          <w:ilvl w:val="0"/>
+          <w:numId w:val="2"/>
+        </w:numPr>
+        <w:spacing w:after="80"/>
+      </w:pPr>
+      <w:r>
+        <w:rPr>
+          <w:color w:val="444444"/>
+          <w:sz w:val="22"/>
+          <w:szCs w:val="22"/>
+        </w:rPr>
+        <w:t xml:space="preserve">Optional: paste a YouTube link or image URL.</w:t>
+      </w:r>
+    </w:p>
+    <w:p>
+      <w:pPr>
+        <w:pStyle w:val="ListParagraph"/>
+        <w:numPr>
+          <w:ilvl w:val="0"/>
+          <w:numId w:val="2"/>
+        </w:numPr>
+        <w:spacing w:after="80"/>
+      </w:pPr>
+      <w:r>
+        <w:rPr>
+          <w:color w:val="444444"/>
+          <w:sz w:val="22"/>
+          <w:szCs w:val="22"/>
+        </w:rPr>
+        <w:t xml:space="preserve">Click Create &amp; Publish.</w:t>
+      </w:r>
+    </w:p>
+    <w:p>
+      <w:pPr>
+        <w:pStyle w:val="ListParagraph"/>
+        <w:numPr>
+          <w:ilvl w:val="0"/>
+          <w:numId w:val="2"/>
+        </w:numPr>
+        <w:spacing w:after="80"/>
+      </w:pPr>
+      <w:r>
+        <w:rPr>
+          <w:color w:val="444444"/>
+          <w:sz w:val="22"/>
+          <w:szCs w:val="22"/>
+        </w:rPr>
+        <w:t xml:space="preserve">Find it later at https://gmfproductions904.com/news</w:t>
       </w:r>
     </w:p>
     <w:p>
@@ -1390,7 +1434,143 @@
           <w:sz w:val="40"/>
           <w:szCs w:val="40"/>
         </w:rPr>
-        <w:t xml:space="preserve">9. Need Help?</w:t>
+        <w:t xml:space="preserve">9. Rules to Remember</w:t>
+      </w:r>
+    </w:p>
+    <w:p>
+      <w:pPr>
+        <w:pStyle w:val="ListParagraph"/>
+        <w:numPr>
+          <w:ilvl w:val="0"/>
+          <w:numId w:val="1"/>
+        </w:numPr>
+        <w:spacing w:after="80"/>
+      </w:pPr>
+      <w:r>
+        <w:rPr>
+          <w:color w:val="444444"/>
+          <w:sz w:val="22"/>
+          <w:szCs w:val="22"/>
+        </w:rPr>
+        <w:t xml:space="preserve">Always click Save &amp; Publish when you are done.</w:t>
+      </w:r>
+    </w:p>
+    <w:p>
+      <w:pPr>
+        <w:pStyle w:val="ListParagraph"/>
+        <w:numPr>
+          <w:ilvl w:val="0"/>
+          <w:numId w:val="1"/>
+        </w:numPr>
+        <w:spacing w:after="80"/>
+      </w:pPr>
+      <w:r>
+        <w:rPr>
+          <w:color w:val="444444"/>
+          <w:sz w:val="22"/>
+          <w:szCs w:val="22"/>
+        </w:rPr>
+        <w:t xml:space="preserve">Prices are dollars only — 25 means $25.00.</w:t>
+      </w:r>
+    </w:p>
+    <w:p>
+      <w:pPr>
+        <w:pStyle w:val="ListParagraph"/>
+        <w:numPr>
+          <w:ilvl w:val="0"/>
+          <w:numId w:val="1"/>
+        </w:numPr>
+        <w:spacing w:after="80"/>
+      </w:pPr>
+      <w:r>
+        <w:rPr>
+          <w:color w:val="444444"/>
+          <w:sz w:val="22"/>
+          <w:szCs w:val="22"/>
+        </w:rPr>
+        <w:t xml:space="preserve">Paste full YouTube links; you do not need to find the ID yourself.</w:t>
+      </w:r>
+    </w:p>
+    <w:p>
+      <w:pPr>
+        <w:pStyle w:val="ListParagraph"/>
+        <w:numPr>
+          <w:ilvl w:val="0"/>
+          <w:numId w:val="1"/>
+        </w:numPr>
+        <w:spacing w:after="80"/>
+      </w:pPr>
+      <w:r>
+        <w:rPr>
+          <w:color w:val="444444"/>
+          <w:sz w:val="22"/>
+          <w:szCs w:val="22"/>
+        </w:rPr>
+        <w:t xml:space="preserve">For backgrounds, upload a JPG/PNG — share links (iCloud/Drive/Canva) will not show on the site.</w:t>
+      </w:r>
+    </w:p>
+    <w:p>
+      <w:pPr>
+        <w:pStyle w:val="ListParagraph"/>
+        <w:numPr>
+          <w:ilvl w:val="0"/>
+          <w:numId w:val="1"/>
+        </w:numPr>
+        <w:spacing w:after="80"/>
+      </w:pPr>
+      <w:r>
+        <w:rPr>
+          <w:color w:val="444444"/>
+          <w:sz w:val="22"/>
+          <w:szCs w:val="22"/>
+        </w:rPr>
+        <w:t xml:space="preserve">If Save fails with a Git Gateway error, tell Chris — that setting lives in Netlify.</w:t>
+      </w:r>
+    </w:p>
+    <w:p>
+      <w:pPr>
+        <w:pStyle w:val="ListParagraph"/>
+        <w:numPr>
+          <w:ilvl w:val="0"/>
+          <w:numId w:val="1"/>
+        </w:numPr>
+        <w:spacing w:after="80"/>
+      </w:pPr>
+      <w:r>
+        <w:rPr>
+          <w:color w:val="444444"/>
+          <w:sz w:val="22"/>
+          <w:szCs w:val="22"/>
+        </w:rPr>
+        <w:t xml:space="preserve">After saving, wait ~90 seconds before checking the live site.</w:t>
+      </w:r>
+    </w:p>
+    <w:p>
+      <w:pPr>
+        <w:pBdr>
+          <w:bottom w:val="single" w:color="CCCCCC" w:sz="4"/>
+        </w:pBdr>
+        <w:spacing w:after="160" w:before="160"/>
+      </w:pPr>
+    </w:p>
+    <w:p>
+      <w:pPr>
+        <w:pStyle w:val="Heading1"/>
+        <w:pBdr>
+          <w:bottom w:val="single" w:color="10b981" w:sz="6"/>
+        </w:pBdr>
+        <w:spacing w:after="120" w:before="360"/>
+      </w:pPr>
+      <w:r>
+        <w:rPr>
+          <w:rFonts w:ascii="Calibri" w:cs="Calibri" w:eastAsia="Calibri" w:hAnsi="Calibri"/>
+          <w:b/>
+          <w:bCs/>
+          <w:color w:val="050505"/>
+          <w:sz w:val="40"/>
+          <w:szCs w:val="40"/>
+        </w:rPr>
+        <w:t xml:space="preserve">10. Need Help?</w:t>
       </w:r>
     </w:p>
     <w:p>

</xml_diff>